<commit_message>
fix(render,core): text and DOCX rendering drop binding aliases (#1400)
* fix(render,core): text and DOCX rendering drop binding aliases

Text and DOCX templates name values only as {{fields.x}}. renderText and
renderDocx lose the bindings option, the text and DOCX renderers ignore
layer bindings, and RenderRequest has no bindings. The form render
bindings option and paradoc render --bindings apply to PDF layers only
and are refused for any other layer.

Co-Authored-By: Claude Opus 5.5 (1M context) <noreply@anthropic.com>
Claude-Session: https://claude.ai/code/session_013n7RrEVZtmXLp4b5CFe3aH

* fix(core,cli): drop inline builder bindings; test the CLI refusal

Co-Authored-By: Claude Opus 5.5 (1M context) <noreply@anthropic.com>
Claude-Session: https://claude.ai/code/session_013n7RrEVZtmXLp4b5CFe3aH

---------

Co-authored-by: Claude Opus 5.5 (1M context) <noreply@anthropic.com>
</commit_message>
<xml_diff>
--- a/apps/cli/tests/fixtures/pet-addendum.docx
+++ b/apps/cli/tests/fixtures/pet-addendum.docx
@@ -16,7 +16,7 @@
       </w:r>
       <w:r>
         <w:tab/>
-        <w:t>{{name}}</w:t>
+        <w:t>{{fields.name}}</w:t>
       </w:r>
     </w:p>
     <w:p>
@@ -25,7 +25,7 @@
       </w:r>
       <w:r>
         <w:tab/>
-        <w:t>{{weight}}</w:t>
+        <w:t>{{fields.weight}}</w:t>
       </w:r>
     </w:p>
     <w:p>
@@ -34,7 +34,7 @@
       </w:r>
       <w:r>
         <w:tab/>
-        <w:t>{{species}}</w:t>
+        <w:t>{{fields.species}}</w:t>
       </w:r>
     </w:p>
     <w:p>
@@ -49,7 +49,7 @@
       </w:r>
       <w:proofErr w:type="spellStart"/>
       <w:r>
-        <w:t>hasVaccination</w:t>
+        <w:t>fields.hasVaccination</w:t>
       </w:r>
       <w:proofErr w:type="spellEnd"/>
       <w:r>

</xml_diff>